<commit_message>
Generalize to full 2D plane (all quadrants)
- Dataset generation now spans all quadrants (θ ∈ [0, 2π])
- Full circles replace quarter-circles in boundary plots
- Adaptive initial grid for radius optimization
- Axis limits auto-computed from data extent (symmetric)
- DOCX report updated to reflect full-plane formulation
- backward-compatible: full_plane=False restores first-quadrant mode

Made-with: Cursor
</commit_message>
<xml_diff>
--- a/rapport_methode.docx
+++ b/rapport_methode.docx
@@ -33,7 +33,7 @@
     </w:p>
     <w:p>
       <w:r>
-        <w:t>On considère un problème de classification de données bidimensionnelles (I, F) en 4 classes ordonnées d'exposition E ∈ {1, 2, 3, 4}, où E = 1 correspond à une faible exposition énergétique et E = 4 à une exposition très élevée. Les deux variables I et F représentent respectivement l'intensité et la fréquence (ou la durée) de l'exposition. Les frontières de séparation sont des quarts de cercle dans le premier quadrant (I ≥ 0, F ≥ 0).</w:t>
+        <w:t>On considère un problème de classification de données bidimensionnelles (I, F) en 4 classes ordonnées d'exposition E ∈ {1, 2, 3, 4}, où E = 1 correspond à une faible exposition énergétique et E = 4 à une exposition très élevée. Les deux variables I et F caractérisent l'exposition. Les frontières de séparation sont des cercles concentriques centrés à l'origine dans le plan 2D complet (tous quadrants).</w:t>
       </w:r>
     </w:p>
     <w:p>
@@ -59,7 +59,7 @@
     </w:p>
     <w:p>
       <w:r>
-        <w:t>Les 4 classes sont séparées par 3 cercles concentriques de rayons r₁ &lt; r₂ &lt; r₃. Les rayons optimaux sont déterminés par minimisation du taux de mauvaise classification via l'algorithme de Nelder-Mead (scipy.optimize).</w:t>
+        <w:t>Les 4 classes sont séparées par 3 cercles concentriques de rayons r₁ &lt; r₂ &lt; r₃. Les rayons optimaux sont déterminés par minimisation du taux de mauvaise classification via l'algorithme de Nelder-Mead (scipy.optimize). La méthode fonctionne quel que soit le quadrant car seule la distance à l'origine intervient.</w:t>
       </w:r>
     </w:p>
     <w:p>
@@ -72,7 +72,7 @@
         <w:pStyle w:val="NoSpacing"/>
       </w:pPr>
       <w:r>
-        <w:t xml:space="preserve">    Frontière 1 :  I² + F² = 7.2359   (r1 = 2.6900)</w:t>
+        <w:t xml:space="preserve">    Frontière 1 :  I² + F² = 7.0199   (r1 = 2.6495)</w:t>
       </w:r>
     </w:p>
     <w:p>
@@ -80,7 +80,7 @@
         <w:pStyle w:val="NoSpacing"/>
       </w:pPr>
       <w:r>
-        <w:t xml:space="preserve">    Frontière 2 :  I² + F² = 32.0123   (r2 = 5.6579)</w:t>
+        <w:t xml:space="preserve">    Frontière 2 :  I² + F² = 32.9882   (r2 = 5.7435)</w:t>
       </w:r>
     </w:p>
     <w:p>
@@ -88,7 +88,7 @@
         <w:pStyle w:val="NoSpacing"/>
       </w:pPr>
       <w:r>
-        <w:t xml:space="preserve">    Frontière 3 :  I² + F² = 68.9500   (r3 = 8.3036)</w:t>
+        <w:t xml:space="preserve">    Frontière 3 :  I² + F² = 87.1195   (r3 = 9.3338)</w:t>
       </w:r>
     </w:p>
     <w:p>
@@ -136,6 +136,14 @@
     </w:p>
     <w:p>
       <w:pPr>
+        <w:pStyle w:val="ListBullet"/>
+      </w:pPr>
+      <w:r>
+        <w:t>La formulation est invariante par rotation (seul r compte).</w:t>
+      </w:r>
+    </w:p>
+    <w:p>
+      <w:pPr>
         <w:pStyle w:val="Heading2"/>
       </w:pPr>
       <w:r>
@@ -144,7 +152,7 @@
     </w:p>
     <w:p>
       <w:r>
-        <w:t>Le modèle cumulative s'écrit :</w:t>
+        <w:t>Le modèle cumulatif s'écrit :</w:t>
       </w:r>
     </w:p>
     <w:p>
@@ -157,7 +165,7 @@
     </w:p>
     <w:p>
       <w:r>
-        <w:t>où σ(x) = 1 / (1 + exp(−x)) est la fonction sigmoïde logistique, α₁ &lt; α₂ &lt; α₃ sont les seuils (intercepts) et β &gt; 0 est la pente commune (proportional odds assumption).</w:t>
+        <w:t>où σ(x) = 1 / (1 + exp(−x)) est la fonction sigmoïde logistique, α₁ &lt; α₂ &lt; α₃ sont les seuils (intercepts) et β &gt; 0 est la pente commune (proportional odds assumption). La seule variable explicative est r = √(I² + F²), ce qui rend le modèle valide quel que soit le signe de I et F.</w:t>
       </w:r>
     </w:p>
     <w:p>
@@ -220,7 +228,7 @@
         <w:pStyle w:val="NoSpacing"/>
       </w:pPr>
       <w:r>
-        <w:t xml:space="preserve">    α1 = 658.1425</w:t>
+        <w:t xml:space="preserve">    α1 = 446.1697</w:t>
       </w:r>
     </w:p>
     <w:p>
@@ -228,7 +236,7 @@
         <w:pStyle w:val="NoSpacing"/>
       </w:pPr>
       <w:r>
-        <w:t xml:space="preserve">    α2 = 1387.4102</w:t>
+        <w:t xml:space="preserve">    α2 = 839.7483</w:t>
       </w:r>
     </w:p>
     <w:p>
@@ -236,7 +244,7 @@
         <w:pStyle w:val="NoSpacing"/>
       </w:pPr>
       <w:r>
-        <w:t xml:space="preserve">    α3 = 2145.2095</w:t>
+        <w:t xml:space="preserve">    α3 = 1263.1778</w:t>
       </w:r>
     </w:p>
     <w:p>
@@ -244,7 +252,7 @@
         <w:pStyle w:val="NoSpacing"/>
       </w:pPr>
       <w:r>
-        <w:t xml:space="preserve">    β  = 232.6944</w:t>
+        <w:t xml:space="preserve">    β  = 138.6210</w:t>
       </w:r>
     </w:p>
     <w:p>
@@ -263,7 +271,7 @@
     </w:p>
     <w:p>
       <w:r>
-        <w:t>Les seuils αₖ/β correspondent aux rayons de transition entre classes. La pente β contrôle la netteté de la transition : plus β est grand, plus la transition est abrupte. Aux frontières (r ≈ αₖ/β), l'incertitude est maximale, ce qui reflète l'ambiguïté physique de classification.</w:t>
+        <w:t>Les seuils αₖ/β correspondent aux rayons de transition entre classes. La pente β contrôle la netteté de la transition : plus β est grand, plus la transition est abrupte. Aux frontières (r ≈ αₖ/β), l'incertitude est maximale, ce qui reflète l'ambiguïté physique de classification. Cette interprétation est valide dans tout le plan 2D car r est invariant par rotation.</w:t>
       </w:r>
     </w:p>
     <w:p>
@@ -271,7 +279,7 @@
         <w:pStyle w:val="NoSpacing"/>
       </w:pPr>
       <w:r>
-        <w:t xml:space="preserve">    Transition E=1/E=2 : r = α1/β = 2.8284</w:t>
+        <w:t xml:space="preserve">    Transition E=1/E=2 : r = α1/β = 3.2186</w:t>
       </w:r>
     </w:p>
     <w:p>
@@ -279,7 +287,7 @@
         <w:pStyle w:val="NoSpacing"/>
       </w:pPr>
       <w:r>
-        <w:t xml:space="preserve">    Transition E=2/E=3 : r = α2/β = 5.9624</w:t>
+        <w:t xml:space="preserve">    Transition E=2/E=3 : r = α2/β = 6.0579</w:t>
       </w:r>
     </w:p>
     <w:p>
@@ -287,7 +295,7 @@
         <w:pStyle w:val="NoSpacing"/>
       </w:pPr>
       <w:r>
-        <w:t xml:space="preserve">    Transition E=3/E=4 : r = α3/β = 9.2190</w:t>
+        <w:t xml:space="preserve">    Transition E=3/E=4 : r = α3/β = 9.1125</w:t>
       </w:r>
     </w:p>
     <w:p>
@@ -307,6 +315,9 @@
         <w:t xml:space="preserve">  (b) quantifier l'incertitude de cette classification via des probabilités calibrées,</w:t>
         <w:br/>
         <w:t xml:space="preserve">  (c) identifier les zones de transition où l'exposition est ambiguë.</w:t>
+        <w:br/>
+        <w:br/>
+        <w:t>La méthode est intrinsèquement invariante par rotation : seule la distance à l'origine r = √(I² + F²) détermine la classe. Les données peuvent donc se situer dans n'importe quel quadrant du plan 2D.</w:t>
       </w:r>
     </w:p>
     <w:sectPr>

</xml_diff>

<commit_message>
Add configurable circle centre (default: centroid of class 1)
- New center parameter propagated to all functions
  (classify_by_radii, fit_circle_boundaries, fit_ordinal_logistic,
   plot_boundaries, plot_ordinal_probabilities, generate_report)
- compute_default_center() returns centroid of class E=1
- Distance formula now r = sqrt((I-I0)² + (F-F0)²)
- Centre displayed as red cross on both plots
- Boundary equations updated to (I-I0)² + (F-F0)² = r²
- DOCX report includes new section on centre choice

Made-with: Cursor
</commit_message>
<xml_diff>
--- a/rapport_methode.docx
+++ b/rapport_methode.docx
@@ -33,7 +33,7 @@
     </w:p>
     <w:p>
       <w:r>
-        <w:t>On considère un problème de classification de données bidimensionnelles (I, F) en 4 classes ordonnées d'exposition E ∈ {1, 2, 3, 4}, où E = 1 correspond à une faible exposition énergétique et E = 4 à une exposition très élevée. Les deux variables I et F caractérisent l'exposition. Les frontières de séparation sont des cercles concentriques centrés à l'origine dans le plan 2D complet (tous quadrants).</w:t>
+        <w:t>On considère un problème de classification de données bidimensionnelles (I, F) en 4 classes ordonnées d'exposition E ∈ {1, 2, 3, 4}, où E = 1 correspond à une faible exposition énergétique et E = 4 à une exposition très élevée. Les frontières de séparation sont des cercles concentriques centrés en un point (I₀, F₀) = (-0.1336, 0.0356), choisi par défaut comme le barycentre de la classe 1 (exposition la plus faible).</w:t>
       </w:r>
     </w:p>
     <w:p>
@@ -46,7 +46,7 @@
     </w:p>
     <w:p>
       <w:r>
-        <w:t>La variable d'exposition combinée est définie comme la distance à l'origine :</w:t>
+        <w:t>La variable d'exposition combinée est définie comme la distance au centre :</w:t>
       </w:r>
     </w:p>
     <w:p>
@@ -54,12 +54,12 @@
         <w:pStyle w:val="NoSpacing"/>
       </w:pPr>
       <w:r>
-        <w:t xml:space="preserve">    r = √(I² + F²)</w:t>
+        <w:t xml:space="preserve">    r = √((I − I₀)² + (F − F₀)²)    avec (I₀, F₀) = (-0.1336, 0.0356)</w:t>
       </w:r>
     </w:p>
     <w:p>
       <w:r>
-        <w:t>Les 4 classes sont séparées par 3 cercles concentriques de rayons r₁ &lt; r₂ &lt; r₃. Les rayons optimaux sont déterminés par minimisation du taux de mauvaise classification via l'algorithme de Nelder-Mead (scipy.optimize). La méthode fonctionne quel que soit le quadrant car seule la distance à l'origine intervient.</w:t>
+        <w:t>Les 4 classes sont séparées par 3 cercles concentriques de rayons r₁ &lt; r₂ &lt; r₃. Les rayons optimaux sont déterminés par minimisation du taux de mauvaise classification via Nelder-Mead (scipy.optimize).</w:t>
       </w:r>
     </w:p>
     <w:p>
@@ -72,7 +72,7 @@
         <w:pStyle w:val="NoSpacing"/>
       </w:pPr>
       <w:r>
-        <w:t xml:space="preserve">    Frontière 1 :  I² + F² = 7.0199   (r1 = 2.6495)</w:t>
+        <w:t xml:space="preserve">    Frontière 1 :  (I − I₀)² + (F − F₀)² = 10.0491   (r1 = 3.1700)</w:t>
       </w:r>
     </w:p>
     <w:p>
@@ -80,7 +80,7 @@
         <w:pStyle w:val="NoSpacing"/>
       </w:pPr>
       <w:r>
-        <w:t xml:space="preserve">    Frontière 2 :  I² + F² = 32.9882   (r2 = 5.7435)</w:t>
+        <w:t xml:space="preserve">    Frontière 2 :  (I − I₀)² + (F − F₀)² = 33.8536   (r2 = 5.8184)</w:t>
       </w:r>
     </w:p>
     <w:p>
@@ -88,7 +88,7 @@
         <w:pStyle w:val="NoSpacing"/>
       </w:pPr>
       <w:r>
-        <w:t xml:space="preserve">    Frontière 3 :  I² + F² = 87.1195   (r3 = 9.3338)</w:t>
+        <w:t xml:space="preserve">    Frontière 3 :  (I − I₀)² + (F − F₀)² = 76.1715   (r3 = 8.7276)</w:t>
       </w:r>
     </w:p>
     <w:p>
@@ -107,7 +107,7 @@
     </w:p>
     <w:p>
       <w:r>
-        <w:t>Pour obtenir des probabilités d'appartenance à chaque classe, on utilise un modèle de régression logistique ordinale cumulative (proportional odds model). Ce modèle est particulièrement adapté car :</w:t>
+        <w:t>Pour obtenir des probabilités d'appartenance à chaque classe, on utilise un modèle de régression logistique ordinale cumulative (proportional odds model). Ce modèle est adapté car :</w:t>
       </w:r>
     </w:p>
     <w:p>
@@ -139,7 +139,7 @@
         <w:pStyle w:val="ListBullet"/>
       </w:pPr>
       <w:r>
-        <w:t>La formulation est invariante par rotation (seul r compte).</w:t>
+        <w:t>La formulation est invariante par rotation autour du centre choisi.</w:t>
       </w:r>
     </w:p>
     <w:p>
@@ -165,7 +165,7 @@
     </w:p>
     <w:p>
       <w:r>
-        <w:t>où σ(x) = 1 / (1 + exp(−x)) est la fonction sigmoïde logistique, α₁ &lt; α₂ &lt; α₃ sont les seuils (intercepts) et β &gt; 0 est la pente commune (proportional odds assumption). La seule variable explicative est r = √(I² + F²), ce qui rend le modèle valide quel que soit le signe de I et F.</w:t>
+        <w:t>où σ(x) = 1 / (1 + exp(−x)) est la fonction sigmoïde logistique, α₁ &lt; α₂ &lt; α₃ sont les seuils et β &gt; 0 est la pente commune. La variable explicative est r = √((I−I₀)² + (F−F₀)²).</w:t>
       </w:r>
     </w:p>
     <w:p>
@@ -215,7 +215,7 @@
     </w:p>
     <w:p>
       <w:r>
-        <w:t>Les paramètres sont estimés par maximum de vraisemblance (minimisation de la log-vraisemblance négative) via Nelder-Mead. Les valeurs initiales des seuils sont dérivées des rayons optimaux de l'étape 1 (αₖ⁰ = β⁰ · rₖ).</w:t>
+        <w:t>Les paramètres sont estimés par maximum de vraisemblance. Les valeurs initiales des seuils sont dérivées des rayons optimaux de l'étape 1 (αₖ⁰ = β⁰ · rₖ).</w:t>
       </w:r>
     </w:p>
     <w:p>
@@ -228,7 +228,7 @@
         <w:pStyle w:val="NoSpacing"/>
       </w:pPr>
       <w:r>
-        <w:t xml:space="preserve">    α1 = 446.1697</w:t>
+        <w:t xml:space="preserve">    α1 = 408.8681</w:t>
       </w:r>
     </w:p>
     <w:p>
@@ -236,7 +236,7 @@
         <w:pStyle w:val="NoSpacing"/>
       </w:pPr>
       <w:r>
-        <w:t xml:space="preserve">    α2 = 839.7483</w:t>
+        <w:t xml:space="preserve">    α2 = 778.5050</w:t>
       </w:r>
     </w:p>
     <w:p>
@@ -244,7 +244,7 @@
         <w:pStyle w:val="NoSpacing"/>
       </w:pPr>
       <w:r>
-        <w:t xml:space="preserve">    α3 = 1263.1778</w:t>
+        <w:t xml:space="preserve">    α3 = 1154.0318</w:t>
       </w:r>
     </w:p>
     <w:p>
@@ -252,13 +252,13 @@
         <w:pStyle w:val="NoSpacing"/>
       </w:pPr>
       <w:r>
-        <w:t xml:space="preserve">    β  = 138.6210</w:t>
+        <w:t xml:space="preserve">    β  = 130.4790</w:t>
       </w:r>
     </w:p>
     <w:p>
       <w:r>
         <w:br/>
-        <w:t>Précision de la classification par probabilité maximale : 100.0%</w:t>
+        <w:t>Précision par probabilité maximale : 100.0%</w:t>
       </w:r>
     </w:p>
     <w:p>
@@ -271,7 +271,7 @@
     </w:p>
     <w:p>
       <w:r>
-        <w:t>Les seuils αₖ/β correspondent aux rayons de transition entre classes. La pente β contrôle la netteté de la transition : plus β est grand, plus la transition est abrupte. Aux frontières (r ≈ αₖ/β), l'incertitude est maximale, ce qui reflète l'ambiguïté physique de classification. Cette interprétation est valide dans tout le plan 2D car r est invariant par rotation.</w:t>
+        <w:t>Les seuils αₖ/β correspondent aux rayons de transition. La pente β contrôle la netteté : plus β est grand, plus la transition est abrupte. Aux frontières (r ≈ αₖ/β), l'incertitude est maximale.</w:t>
       </w:r>
     </w:p>
     <w:p>
@@ -279,7 +279,7 @@
         <w:pStyle w:val="NoSpacing"/>
       </w:pPr>
       <w:r>
-        <w:t xml:space="preserve">    Transition E=1/E=2 : r = α1/β = 3.2186</w:t>
+        <w:t xml:space="preserve">    Transition E=1/E=2 : r = α1/β = 3.1336</w:t>
       </w:r>
     </w:p>
     <w:p>
@@ -287,7 +287,7 @@
         <w:pStyle w:val="NoSpacing"/>
       </w:pPr>
       <w:r>
-        <w:t xml:space="preserve">    Transition E=2/E=3 : r = α2/β = 6.0579</w:t>
+        <w:t xml:space="preserve">    Transition E=2/E=3 : r = α2/β = 5.9665</w:t>
       </w:r>
     </w:p>
     <w:p>
@@ -295,7 +295,20 @@
         <w:pStyle w:val="NoSpacing"/>
       </w:pPr>
       <w:r>
-        <w:t xml:space="preserve">    Transition E=3/E=4 : r = α3/β = 9.1125</w:t>
+        <w:t xml:space="preserve">    Transition E=3/E=4 : r = α3/β = 8.8446</w:t>
+      </w:r>
+    </w:p>
+    <w:p>
+      <w:pPr>
+        <w:pStyle w:val="Heading2"/>
+      </w:pPr>
+      <w:r>
+        <w:t>3.4. Choix du centre</w:t>
+      </w:r>
+    </w:p>
+    <w:p>
+      <w:r>
+        <w:t>Le centre des cercles (I₀, F₀) est configurable par l'utilisateur. Par défaut, il est fixé au barycentre de la classe E = 1 (exposition la plus faible), ce qui est physiquement cohérent : le point de moindre exposition constitue un centre naturel autour duquel l'exposition croît radialement.</w:t>
       </w:r>
     </w:p>
     <w:p>
@@ -308,16 +321,16 @@
     </w:p>
     <w:p>
       <w:r>
-        <w:t>La combinaison d'une classification par frontières circulaires et d'une régression logistique ordinale fournit un cadre complet pour :</w:t>
+        <w:t>La combinaison d'une classification par frontières circulaires centrées et d'une régression logistique ordinale fournit un cadre complet pour :</w:t>
         <w:br/>
         <w:t xml:space="preserve">  (a) classifier les points en classes d'exposition,</w:t>
         <w:br/>
-        <w:t xml:space="preserve">  (b) quantifier l'incertitude de cette classification via des probabilités calibrées,</w:t>
+        <w:t xml:space="preserve">  (b) quantifier l'incertitude via des probabilités calibrées,</w:t>
         <w:br/>
-        <w:t xml:space="preserve">  (c) identifier les zones de transition où l'exposition est ambiguë.</w:t>
+        <w:t xml:space="preserve">  (c) identifier les zones de transition ambiguës.</w:t>
         <w:br/>
         <w:br/>
-        <w:t>La méthode est intrinsèquement invariante par rotation : seule la distance à l'origine r = √(I² + F²) détermine la classe. Les données peuvent donc se situer dans n'importe quel quadrant du plan 2D.</w:t>
+        <w:t>Le centre des cercles est paramétrable, permettant d'adapter le modèle à différentes configurations géométriques des données.</w:t>
       </w:r>
     </w:p>
     <w:sectPr>

</xml_diff>